<commit_message>
Atualiza CV em Word com listas reais e ajuste em Conhecimento de negócio
Co-Authored-By: Claude Opus 5.5 <noreply@anthropic.com>
Claude-Session: https://claude.ai/code/session_018PdT5CPsutMSks5h3GZAmF
</commit_message>
<xml_diff>
--- a/CV_Bruno_Reznicek_Generalista.docx
+++ b/CV_Bruno_Reznicek_Generalista.docx
@@ -79,13 +79,7 @@
         <w:rPr>
           <w:color w:val="222222"/>
         </w:rPr>
-        <w:t>Gestor de Projetos e Transformação com 15+ anos de experiência em operações, negócios, planejamento, dados e tecnologia, com trajetória nos setores financeiro, varejo e BPO. Atua na gestão simultânea de contas e projetos de grande porte, conduzindo implantações end-to-end, PMO, WFM, governança de indicadores, riscos, SLAs e stakeholders. Lidera frentes de Qualidade, CX, Treinamento, BI e Planejamento e combina visão executiva com atuação hands-on em Python, SQL, Power BI, Streamlit, Google Cloud, Supabase e</w:t>
-      </w:r>
-      <w:r>
-        <w:rPr>
-          <w:color w:val="222222"/>
-        </w:rPr>
-        <w:t xml:space="preserve"> automações com IA. Histórico de estruturação de operações, melhoria contínua, automação de processos e desenvolvimento de soluções digitais orientadas a problemas reais de negócio.</w:t>
+        <w:t xml:space="preserve">Gestor de Projetos e Transformação com 15+ anos de experiência em operações, negócios, planejamento, dados e tecnologia, com trajetória nos setores financeiro, varejo e BPO. Atua na gestão simultânea de contas e projetos de grande porte, conduzindo implantações end-to-end, PMO, WFM, governança de indicadores, riscos, SLAs e stakeholders. Lidera frentes de Qualidade, CX, Treinamento, BI e Planejamento e combina visão executiva com atuação hands-on em Python, SQL, Power BI, Streamlit, Google Cloud, Supabase e automações com IA. Histórico de estruturação de operações, melhoria contínua, automação de processos e desenvolvimento de soluções digitais orientadas a problemas reais de negócio.</w:t>
       </w:r>
     </w:p>
     <w:p>
@@ -108,17 +102,13 @@
     </w:p>
     <w:p>
       <w:pPr>
+        <w:numPr>
+          <w:ilvl w:val="0"/>
+          <w:numId w:val="90"/>
+        </w:numPr>
         <w:spacing w:after="7" w:line="240" w:lineRule="auto"/>
         <w:ind w:left="245" w:hanging="173"/>
       </w:pPr>
-      <w:r>
-        <w:rPr>
-          <w:b/>
-          <w:color w:val="1F3858"/>
-          <w:sz w:val="17"/>
-        </w:rPr>
-        <w:t xml:space="preserve">• </w:t>
-      </w:r>
       <w:r>
         <w:rPr>
           <w:color w:val="222222"/>
@@ -129,17 +119,13 @@
     </w:p>
     <w:p>
       <w:pPr>
+        <w:numPr>
+          <w:ilvl w:val="0"/>
+          <w:numId w:val="90"/>
+        </w:numPr>
         <w:spacing w:after="7" w:line="240" w:lineRule="auto"/>
         <w:ind w:left="245" w:hanging="173"/>
       </w:pPr>
-      <w:r>
-        <w:rPr>
-          <w:b/>
-          <w:color w:val="1F3858"/>
-          <w:sz w:val="17"/>
-        </w:rPr>
-        <w:t xml:space="preserve">• </w:t>
-      </w:r>
       <w:r>
         <w:rPr>
           <w:color w:val="222222"/>
@@ -150,17 +136,13 @@
     </w:p>
     <w:p>
       <w:pPr>
+        <w:numPr>
+          <w:ilvl w:val="0"/>
+          <w:numId w:val="90"/>
+        </w:numPr>
         <w:spacing w:after="7" w:line="240" w:lineRule="auto"/>
         <w:ind w:left="245" w:hanging="173"/>
       </w:pPr>
-      <w:r>
-        <w:rPr>
-          <w:b/>
-          <w:color w:val="1F3858"/>
-          <w:sz w:val="17"/>
-        </w:rPr>
-        <w:t xml:space="preserve">• </w:t>
-      </w:r>
       <w:r>
         <w:rPr>
           <w:color w:val="222222"/>
@@ -171,17 +153,13 @@
     </w:p>
     <w:p>
       <w:pPr>
+        <w:numPr>
+          <w:ilvl w:val="0"/>
+          <w:numId w:val="90"/>
+        </w:numPr>
         <w:spacing w:after="7" w:line="240" w:lineRule="auto"/>
         <w:ind w:left="245" w:hanging="173"/>
       </w:pPr>
-      <w:r>
-        <w:rPr>
-          <w:b/>
-          <w:color w:val="1F3858"/>
-          <w:sz w:val="17"/>
-        </w:rPr>
-        <w:t xml:space="preserve">• </w:t>
-      </w:r>
       <w:r>
         <w:rPr>
           <w:color w:val="222222"/>
@@ -192,17 +170,13 @@
     </w:p>
     <w:p>
       <w:pPr>
+        <w:numPr>
+          <w:ilvl w:val="0"/>
+          <w:numId w:val="90"/>
+        </w:numPr>
         <w:spacing w:after="7" w:line="240" w:lineRule="auto"/>
         <w:ind w:left="245" w:hanging="173"/>
       </w:pPr>
-      <w:r>
-        <w:rPr>
-          <w:b/>
-          <w:color w:val="1F3858"/>
-          <w:sz w:val="17"/>
-        </w:rPr>
-        <w:t xml:space="preserve">• </w:t>
-      </w:r>
       <w:r>
         <w:rPr>
           <w:color w:val="222222"/>
@@ -213,17 +187,13 @@
     </w:p>
     <w:p>
       <w:pPr>
+        <w:numPr>
+          <w:ilvl w:val="0"/>
+          <w:numId w:val="90"/>
+        </w:numPr>
         <w:spacing w:after="7" w:line="240" w:lineRule="auto"/>
         <w:ind w:left="245" w:hanging="173"/>
       </w:pPr>
-      <w:r>
-        <w:rPr>
-          <w:b/>
-          <w:color w:val="1F3858"/>
-          <w:sz w:val="17"/>
-        </w:rPr>
-        <w:t xml:space="preserve">• </w:t>
-      </w:r>
       <w:r>
         <w:rPr>
           <w:color w:val="222222"/>
@@ -275,17 +245,13 @@
     </w:p>
     <w:p>
       <w:pPr>
+        <w:numPr>
+          <w:ilvl w:val="0"/>
+          <w:numId w:val="90"/>
+        </w:numPr>
         <w:spacing w:after="11" w:line="240" w:lineRule="auto"/>
         <w:ind w:left="245" w:hanging="173"/>
       </w:pPr>
-      <w:r>
-        <w:rPr>
-          <w:b/>
-          <w:color w:val="1F3858"/>
-          <w:sz w:val="17"/>
-        </w:rPr>
-        <w:t xml:space="preserve">• </w:t>
-      </w:r>
       <w:r>
         <w:rPr>
           <w:color w:val="222222"/>
@@ -296,17 +262,13 @@
     </w:p>
     <w:p>
       <w:pPr>
+        <w:numPr>
+          <w:ilvl w:val="0"/>
+          <w:numId w:val="90"/>
+        </w:numPr>
         <w:spacing w:after="11" w:line="240" w:lineRule="auto"/>
         <w:ind w:left="245" w:hanging="173"/>
       </w:pPr>
-      <w:r>
-        <w:rPr>
-          <w:b/>
-          <w:color w:val="1F3858"/>
-          <w:sz w:val="17"/>
-        </w:rPr>
-        <w:t xml:space="preserve">• </w:t>
-      </w:r>
       <w:r>
         <w:rPr>
           <w:color w:val="222222"/>
@@ -317,17 +279,13 @@
     </w:p>
     <w:p>
       <w:pPr>
+        <w:numPr>
+          <w:ilvl w:val="0"/>
+          <w:numId w:val="90"/>
+        </w:numPr>
         <w:spacing w:after="11" w:line="240" w:lineRule="auto"/>
         <w:ind w:left="245" w:hanging="173"/>
       </w:pPr>
-      <w:r>
-        <w:rPr>
-          <w:b/>
-          <w:color w:val="1F3858"/>
-          <w:sz w:val="17"/>
-        </w:rPr>
-        <w:t xml:space="preserve">• </w:t>
-      </w:r>
       <w:r>
         <w:rPr>
           <w:color w:val="222222"/>
@@ -338,17 +296,13 @@
     </w:p>
     <w:p>
       <w:pPr>
+        <w:numPr>
+          <w:ilvl w:val="0"/>
+          <w:numId w:val="90"/>
+        </w:numPr>
         <w:spacing w:after="11" w:line="240" w:lineRule="auto"/>
         <w:ind w:left="245" w:hanging="173"/>
       </w:pPr>
-      <w:r>
-        <w:rPr>
-          <w:b/>
-          <w:color w:val="1F3858"/>
-          <w:sz w:val="17"/>
-        </w:rPr>
-        <w:t xml:space="preserve">• </w:t>
-      </w:r>
       <w:r>
         <w:rPr>
           <w:color w:val="222222"/>
@@ -359,17 +313,13 @@
     </w:p>
     <w:p>
       <w:pPr>
+        <w:numPr>
+          <w:ilvl w:val="0"/>
+          <w:numId w:val="90"/>
+        </w:numPr>
         <w:spacing w:after="11" w:line="240" w:lineRule="auto"/>
         <w:ind w:left="245" w:hanging="173"/>
       </w:pPr>
-      <w:r>
-        <w:rPr>
-          <w:b/>
-          <w:color w:val="1F3858"/>
-          <w:sz w:val="17"/>
-        </w:rPr>
-        <w:t xml:space="preserve">• </w:t>
-      </w:r>
       <w:r>
         <w:rPr>
           <w:color w:val="222222"/>
@@ -380,17 +330,13 @@
     </w:p>
     <w:p>
       <w:pPr>
+        <w:numPr>
+          <w:ilvl w:val="0"/>
+          <w:numId w:val="90"/>
+        </w:numPr>
         <w:spacing w:after="11" w:line="240" w:lineRule="auto"/>
         <w:ind w:left="245" w:hanging="173"/>
       </w:pPr>
-      <w:r>
-        <w:rPr>
-          <w:b/>
-          <w:color w:val="1F3858"/>
-          <w:sz w:val="17"/>
-        </w:rPr>
-        <w:t xml:space="preserve">• </w:t>
-      </w:r>
       <w:r>
         <w:rPr>
           <w:color w:val="222222"/>
@@ -401,17 +347,13 @@
     </w:p>
     <w:p>
       <w:pPr>
+        <w:numPr>
+          <w:ilvl w:val="0"/>
+          <w:numId w:val="90"/>
+        </w:numPr>
         <w:spacing w:after="11" w:line="240" w:lineRule="auto"/>
         <w:ind w:left="245" w:hanging="173"/>
       </w:pPr>
-      <w:r>
-        <w:rPr>
-          <w:b/>
-          <w:color w:val="1F3858"/>
-          <w:sz w:val="17"/>
-        </w:rPr>
-        <w:t xml:space="preserve">• </w:t>
-      </w:r>
       <w:r>
         <w:rPr>
           <w:color w:val="222222"/>
@@ -440,17 +382,13 @@
     </w:p>
     <w:p>
       <w:pPr>
+        <w:numPr>
+          <w:ilvl w:val="0"/>
+          <w:numId w:val="90"/>
+        </w:numPr>
         <w:spacing w:after="8" w:line="240" w:lineRule="auto"/>
         <w:ind w:left="245" w:hanging="173"/>
       </w:pPr>
-      <w:r>
-        <w:rPr>
-          <w:b/>
-          <w:color w:val="1F3858"/>
-          <w:sz w:val="17"/>
-        </w:rPr>
-        <w:t xml:space="preserve">• </w:t>
-      </w:r>
       <w:r>
         <w:rPr>
           <w:b/>
@@ -469,17 +407,13 @@
     </w:p>
     <w:p>
       <w:pPr>
+        <w:numPr>
+          <w:ilvl w:val="0"/>
+          <w:numId w:val="90"/>
+        </w:numPr>
         <w:spacing w:after="8" w:line="240" w:lineRule="auto"/>
         <w:ind w:left="245" w:hanging="173"/>
       </w:pPr>
-      <w:r>
-        <w:rPr>
-          <w:b/>
-          <w:color w:val="1F3858"/>
-          <w:sz w:val="17"/>
-        </w:rPr>
-        <w:t xml:space="preserve">• </w:t>
-      </w:r>
       <w:r>
         <w:rPr>
           <w:b/>
@@ -498,17 +432,13 @@
     </w:p>
     <w:p>
       <w:pPr>
+        <w:numPr>
+          <w:ilvl w:val="0"/>
+          <w:numId w:val="90"/>
+        </w:numPr>
         <w:spacing w:after="8" w:line="240" w:lineRule="auto"/>
         <w:ind w:left="245" w:hanging="173"/>
       </w:pPr>
-      <w:r>
-        <w:rPr>
-          <w:b/>
-          <w:color w:val="1F3858"/>
-          <w:sz w:val="17"/>
-        </w:rPr>
-        <w:t xml:space="preserve">• </w:t>
-      </w:r>
       <w:r>
         <w:rPr>
           <w:b/>
@@ -527,17 +457,13 @@
     </w:p>
     <w:p>
       <w:pPr>
+        <w:numPr>
+          <w:ilvl w:val="0"/>
+          <w:numId w:val="90"/>
+        </w:numPr>
         <w:spacing w:after="8" w:line="240" w:lineRule="auto"/>
         <w:ind w:left="245" w:hanging="173"/>
       </w:pPr>
-      <w:r>
-        <w:rPr>
-          <w:b/>
-          <w:color w:val="1F3858"/>
-          <w:sz w:val="17"/>
-        </w:rPr>
-        <w:t xml:space="preserve">• </w:t>
-      </w:r>
       <w:r>
         <w:rPr>
           <w:b/>
@@ -556,17 +482,13 @@
     </w:p>
     <w:p>
       <w:pPr>
+        <w:numPr>
+          <w:ilvl w:val="0"/>
+          <w:numId w:val="90"/>
+        </w:numPr>
         <w:spacing w:after="8" w:line="240" w:lineRule="auto"/>
         <w:ind w:left="245" w:hanging="173"/>
       </w:pPr>
-      <w:r>
-        <w:rPr>
-          <w:b/>
-          <w:color w:val="1F3858"/>
-          <w:sz w:val="17"/>
-        </w:rPr>
-        <w:t xml:space="preserve">• </w:t>
-      </w:r>
       <w:r>
         <w:rPr>
           <w:b/>
@@ -585,17 +507,13 @@
     </w:p>
     <w:p>
       <w:pPr>
+        <w:numPr>
+          <w:ilvl w:val="0"/>
+          <w:numId w:val="90"/>
+        </w:numPr>
         <w:spacing w:after="8" w:line="240" w:lineRule="auto"/>
         <w:ind w:left="245" w:hanging="173"/>
       </w:pPr>
-      <w:r>
-        <w:rPr>
-          <w:b/>
-          <w:color w:val="1F3858"/>
-          <w:sz w:val="17"/>
-        </w:rPr>
-        <w:t xml:space="preserve">• </w:t>
-      </w:r>
       <w:r>
         <w:rPr>
           <w:b/>
@@ -660,17 +578,13 @@
     </w:p>
     <w:p>
       <w:pPr>
+        <w:numPr>
+          <w:ilvl w:val="0"/>
+          <w:numId w:val="90"/>
+        </w:numPr>
         <w:spacing w:after="11" w:line="240" w:lineRule="auto"/>
         <w:ind w:left="245" w:hanging="173"/>
       </w:pPr>
-      <w:r>
-        <w:rPr>
-          <w:b/>
-          <w:color w:val="1F3858"/>
-          <w:sz w:val="17"/>
-        </w:rPr>
-        <w:t xml:space="preserve">• </w:t>
-      </w:r>
       <w:r>
         <w:rPr>
           <w:color w:val="222222"/>
@@ -704,17 +618,13 @@
     </w:p>
     <w:p>
       <w:pPr>
+        <w:numPr>
+          <w:ilvl w:val="0"/>
+          <w:numId w:val="90"/>
+        </w:numPr>
         <w:spacing w:after="11" w:line="240" w:lineRule="auto"/>
         <w:ind w:left="245" w:hanging="173"/>
       </w:pPr>
-      <w:r>
-        <w:rPr>
-          <w:b/>
-          <w:color w:val="1F3858"/>
-          <w:sz w:val="17"/>
-        </w:rPr>
-        <w:t xml:space="preserve">• </w:t>
-      </w:r>
       <w:r>
         <w:rPr>
           <w:color w:val="222222"/>
@@ -748,17 +658,13 @@
     </w:p>
     <w:p>
       <w:pPr>
+        <w:numPr>
+          <w:ilvl w:val="0"/>
+          <w:numId w:val="90"/>
+        </w:numPr>
         <w:spacing w:after="11" w:line="240" w:lineRule="auto"/>
         <w:ind w:left="245" w:hanging="173"/>
       </w:pPr>
-      <w:r>
-        <w:rPr>
-          <w:b/>
-          <w:color w:val="1F3858"/>
-          <w:sz w:val="17"/>
-        </w:rPr>
-        <w:t xml:space="preserve">• </w:t>
-      </w:r>
       <w:r>
         <w:rPr>
           <w:color w:val="222222"/>
@@ -792,17 +698,13 @@
     </w:p>
     <w:p>
       <w:pPr>
+        <w:numPr>
+          <w:ilvl w:val="0"/>
+          <w:numId w:val="90"/>
+        </w:numPr>
         <w:spacing w:after="11" w:line="240" w:lineRule="auto"/>
         <w:ind w:left="245" w:hanging="173"/>
       </w:pPr>
-      <w:r>
-        <w:rPr>
-          <w:b/>
-          <w:color w:val="1F3858"/>
-          <w:sz w:val="17"/>
-        </w:rPr>
-        <w:t xml:space="preserve">• </w:t>
-      </w:r>
       <w:r>
         <w:rPr>
           <w:color w:val="222222"/>
@@ -836,17 +738,13 @@
     </w:p>
     <w:p>
       <w:pPr>
+        <w:numPr>
+          <w:ilvl w:val="0"/>
+          <w:numId w:val="90"/>
+        </w:numPr>
         <w:spacing w:after="11" w:line="240" w:lineRule="auto"/>
         <w:ind w:left="245" w:hanging="173"/>
       </w:pPr>
-      <w:r>
-        <w:rPr>
-          <w:b/>
-          <w:color w:val="1F3858"/>
-          <w:sz w:val="17"/>
-        </w:rPr>
-        <w:t xml:space="preserve">• </w:t>
-      </w:r>
       <w:r>
         <w:rPr>
           <w:color w:val="222222"/>
@@ -1047,17 +945,13 @@
     </w:p>
     <w:p>
       <w:pPr>
+        <w:numPr>
+          <w:ilvl w:val="0"/>
+          <w:numId w:val="90"/>
+        </w:numPr>
         <w:spacing w:after="6" w:line="240" w:lineRule="auto"/>
         <w:ind w:left="245" w:hanging="173"/>
       </w:pPr>
-      <w:r>
-        <w:rPr>
-          <w:b/>
-          <w:color w:val="1F3858"/>
-          <w:sz w:val="17"/>
-        </w:rPr>
-        <w:t xml:space="preserve">• </w:t>
-      </w:r>
       <w:r>
         <w:rPr>
           <w:color w:val="222222"/>
@@ -1068,17 +962,13 @@
     </w:p>
     <w:p>
       <w:pPr>
+        <w:numPr>
+          <w:ilvl w:val="0"/>
+          <w:numId w:val="90"/>
+        </w:numPr>
         <w:spacing w:after="6" w:line="240" w:lineRule="auto"/>
         <w:ind w:left="245" w:hanging="173"/>
       </w:pPr>
-      <w:r>
-        <w:rPr>
-          <w:b/>
-          <w:color w:val="1F3858"/>
-          <w:sz w:val="17"/>
-        </w:rPr>
-        <w:t xml:space="preserve">• </w:t>
-      </w:r>
       <w:r>
         <w:rPr>
           <w:color w:val="222222"/>
@@ -1089,23 +979,19 @@
     </w:p>
     <w:p>
       <w:pPr>
+        <w:numPr>
+          <w:ilvl w:val="0"/>
+          <w:numId w:val="90"/>
+        </w:numPr>
         <w:spacing w:after="6" w:line="240" w:lineRule="auto"/>
         <w:ind w:left="245" w:hanging="173"/>
       </w:pPr>
-      <w:r>
-        <w:rPr>
-          <w:b/>
-          <w:color w:val="1F3858"/>
-          <w:sz w:val="17"/>
-        </w:rPr>
-        <w:t xml:space="preserve">• </w:t>
-      </w:r>
       <w:r>
         <w:rPr>
           <w:color w:val="222222"/>
           <w:sz w:val="17"/>
         </w:rPr>
-        <w:t>Experiência setorial em serviços financeiros, varejo, BPO, tecnologia, automação e soluções SaaS.</w:t>
+        <w:t>Experiência setorial também em varejo, tecnologia e soluções SaaS.</w:t>
       </w:r>
     </w:p>
     <w:sectPr>
@@ -1357,6 +1243,24 @@
       </w:pPr>
       <w:rPr>
         <w:rFonts w:ascii="Symbol" w:hAnsi="Symbol" w:hint="default"/>
+      </w:rPr>
+    </w:lvl>
+  </w:abstractNum>
+  <w:abstractNum w:abstractNumId="90">
+    <w:multiLevelType w:val="singleLevel"/>
+    <w:lvl w:ilvl="0">
+      <w:start w:val="1"/>
+      <w:numFmt w:val="bullet"/>
+      <w:lvlText w:val="•"/>
+      <w:lvlJc w:val="left"/>
+      <w:pPr>
+        <w:ind w:left="245" w:hanging="173"/>
+      </w:pPr>
+      <w:rPr>
+        <w:rFonts w:ascii="Arial" w:hAnsi="Arial" w:cs="Arial"/>
+        <w:b/>
+        <w:color w:val="1F3858"/>
+        <w:sz w:val="17"/>
       </w:rPr>
     </w:lvl>
   </w:abstractNum>
@@ -1386,6 +1290,9 @@
   </w:num>
   <w:num w:numId="9" w16cid:durableId="1067997548">
     <w:abstractNumId w:val="0"/>
+  </w:num>
+  <w:num w:numId="90">
+    <w:abstractNumId w:val="90"/>
   </w:num>
 </w:numbering>
 </file>

</xml_diff>